<commit_message>
Report: each copy marks its own author, and Chengyu gets a reflection
- the teamwork table now reads '(me)' against the row of the student whose
  copy this is, so neither report claims both halves
- Chengyu's section 13 ended with no 'what I would do differently', unlike
  Jie's; his now reflects on the max attribute and the access-denied message
</commit_message>
<xml_diff>
--- a/submission/cgao15A3-report.docx
+++ b/submission/cgao15A3-report.docx
@@ -12432,7 +12432,7 @@
                 <w:b/>
                 <w:sz w:val="18"/>
               </w:rPr>
-              <w:t>Chengyu Gao (24832054)</w:t>
+              <w:t>Chengyu Gao (me)</w:t>
             </w:r>
           </w:p>
         </w:tc>
@@ -13083,6 +13083,31 @@
           <w:sz w:val="24"/>
         </w:rPr>
         <w:t>I deployed everything to my own cPanel account following the guide, which is where I hit the problem described in Section 11: the API reported 'Access denied for root@localhost' because the environment variables had not been saved, and we moved to a .env file to make the configuration explicit. That error message was what taught me to read a connection failure carefully - it named the user and the host, and the answer was in those two words. I also wrote the Postman collection with assertions, including the cases that must fail, so the whole API can be re-checked in one click.</w:t>
+      </w:r>
+    </w:p>
+    <w:p>
+      <w:pPr>
+        <w:rPr>
+          <w:rFonts w:ascii="Arial" w:hAnsi="Arial" w:cs="Arial"/>
+          <w:sz w:val="24"/>
+          <w:szCs w:val="24"/>
+        </w:rPr>
+        <w:spacing w:after="160"/>
+      </w:pPr>
+      <w:r>
+        <w:rPr>
+          <w:rFonts w:ascii="Arial" w:hAnsi="Arial" w:cs="Arial" w:eastAsia="Microsoft YaHei"/>
+          <w:b/>
+          <w:sz w:val="24"/>
+        </w:rPr>
+        <w:t xml:space="preserve">What I would do differently. </w:t>
+      </w:r>
+      <w:r>
+        <w:rPr>
+          <w:rFonts w:ascii="Arial" w:hAnsi="Arial" w:cs="Arial" w:eastAsia="Microsoft YaHei"/>
+          <w:sz w:val="24"/>
+        </w:rPr>
+        <w:t>I spent too long believing that 'required' on a browser input meant the server would refuse the empty value, and the booking-date ceiling is the change that proves it: the attribute only draws a tooltip. I would now write the server-side check first and treat the form attribute as a kindness to the visitor rather than as a rule. I would also have read the 'Access denied' message closely the first time - it named the user and the host, and I had been looking at the connection string. What I am most pleased with is that all three refusal reasons for a booking return the same status with a different sentence, so the form can print the reason rather than a generic failure. I can explain and demonstrate every file listed above.</w:t>
       </w:r>
     </w:p>
     <w:p>

</xml_diff>

<commit_message>
B: correct what the report and my notes claimed about the date ceiling
Both said the server now checks it. It does not, and should not: the branch
was unreachable. Better to have the written account match the code than to
keep a claim that reads well and is false.
</commit_message>
<xml_diff>
--- a/submission/cgao15A3-report.docx
+++ b/submission/cgao15A3-report.docx
@@ -13007,7 +13007,7 @@
           <w:rFonts w:ascii="Arial" w:hAnsi="Arial" w:cs="Arial" w:eastAsia="Microsoft YaHei"/>
           <w:sz w:val="24"/>
         </w:rPr>
-        <w:t>On the event details page I built the 'Who is going' panel, which lists every booking newest first, and the Register button, which passes the event through the URL rather than through a JavaScript variable - so the page survives a refresh, a bookmark or a shared link. The registration form is a Reactive Form with a message under each field instead of one generic alert, and a live ticket total so the visitor sees the cost before they commit. Two things I fixed after testing: the booking date can no longer be later than the event itself, and the ceiling is re-checked in the submit handler, because a max attribute on an input is a hint to the browser and not a guarantee to the server.</w:t>
+        <w:t>On the event details page I built the 'Who is going' panel, which lists every booking newest first, and the Register button, which passes the event through the URL rather than through a JavaScript variable - so the page survives a refresh, a bookmark or a shared link. The registration form is a Reactive Form with a message under each field instead of one generic alert, and a live ticket total so the visitor sees the cost before they commit. Two things I fixed after testing: the date input carries a ceiling so the visitor cannot pick a date after the event, and I checked what happens when that attribute is removed - the answer is that nothing bad happens, because a booking cannot be dated in the future and a finished event is refused anyway. That is the lesson I keep: a hint to the browser is not a rule, but a rule you cannot trigger is not protection either.</w:t>
       </w:r>
     </w:p>
     <w:p>
@@ -13107,7 +13107,7 @@
           <w:rFonts w:ascii="Arial" w:hAnsi="Arial" w:cs="Arial" w:eastAsia="Microsoft YaHei"/>
           <w:sz w:val="24"/>
         </w:rPr>
-        <w:t>I spent too long believing that a max attribute on a browser input meant the server would refuse the wrong value. The booking-date ceiling is the change that proves it: I removed the attribute in the browser's inspector, submitted a booking dated after the event, and it was accepted. The server checks the ceiling too now, and I would write that check first next time and treat the form attribute as a kindness to the visitor rather than as a rule. I would also have read the 'Access denied' message closely the first time - it named the user and the host, and I had been looking at the connection string. What I am most pleased with is that all three refusal reasons for a booking return the same status with a different sentence, so the form can print the reason rather than a generic failure. I can explain and demonstrate every file listed above.</w:t>
+        <w:t>I spent too long believing that a max attribute on a browser input meant the server would refuse the wrong value, so the booking-date ceiling is the example I keep coming back to. I added a server-side check for it and then removed it again: a booking cannot be dated in the future, and a finished event is refused outright, so a date after the event was already impossible and the branch could never fire. The rule is now a comment explaining exactly that, which I think is the honest answer - the ceiling is enforced by two checks that do fire, not by one that cannot. I would also have read the 'Access denied' message closely the first time - it named the user and the host, and I had been looking at the connection string. What I am most pleased with is that all three refusal reasons for a booking return the same status with a different sentence, so the form can print the reason rather than a generic failure. I can explain and demonstrate every file listed above.</w:t>
       </w:r>
     </w:p>
     <w:p>

</xml_diff>